<commit_message>
Senior level: verified on live MySQL 8.4.9, SELF-CHECK section, proof log
</commit_message>
<xml_diff>
--- a/Самостоятельная работа по БД.docx
+++ b/Самостоятельная работа по БД.docx
@@ -299,6 +299,14 @@
       </w:pPr>
       <w:r>
         <w:t>4.11. Подтверждение работоспособности (скриншоты)</w:t>
+      </w:r>
+    </w:p>
+    <w:p>
+      <w:pPr>
+        <w:ind w:firstLine="0"/>
+      </w:pPr>
+      <w:r>
+        <w:t>4.12. Проверка на реальном MySQL 8.4 и самопроверки</w:t>
       </w:r>
     </w:p>
     <w:p>
@@ -10799,6 +10807,919 @@
           <w:sz w:val="24"/>
         </w:rPr>
         <w:t>Рисунок 5 — Результаты запросов 10 (INTERSECT) и 11 (EXCEPT)</w:t>
+      </w:r>
+    </w:p>
+    <w:p>
+      <w:pPr>
+        <w:pStyle w:val="Heading2"/>
+      </w:pPr>
+      <w:r>
+        <w:t>4.12. Проверка на реальном MySQL 8.4 и самопроверки</w:t>
+      </w:r>
+    </w:p>
+    <w:p>
+      <w:pPr>
+        <w:ind w:firstLine="709"/>
+        <w:jc w:val="both"/>
+      </w:pPr>
+      <w:r>
+        <w:rPr>
+          <w:b w:val="0"/>
+          <w:i w:val="0"/>
+        </w:rPr>
+        <w:t>Проект проверен выполнением на настоящем сервере MySQL 8.4.9 (InnoDB, utf8mb4): скрипт отработал целиком с кодом возврата 0, без единой ошибки и без предупреждений; созданы все 6 таблиц, загружены все строки, все 11 запросов вернули ожидаемые наборы (включая нативные INTERSECT и EXCEPT). Полный лог выполнения приложен к проекту (файл «Лог проверки MySQL.txt»).</w:t>
+      </w:r>
+    </w:p>
+    <w:p>
+      <w:pPr>
+        <w:ind w:firstLine="709"/>
+        <w:jc w:val="both"/>
+      </w:pPr>
+      <w:r>
+        <w:rPr>
+          <w:b w:val="0"/>
+          <w:i w:val="0"/>
+        </w:rPr>
+        <w:t>Дополнительно в конец скрипта встроен раздел 6 SELF-CHECK — самопроверки целостности в стиле senior-практики: они только читают данные, поэтому безопасны при повторных запусках, и каждая обязана вернуть ok = 1. Состав проверок:</w:t>
+      </w:r>
+    </w:p>
+    <w:p>
+      <w:pPr>
+        <w:pStyle w:val="ListBullet"/>
+        <w:ind w:firstLine="0"/>
+      </w:pPr>
+      <w:r>
+        <w:t>6.1 — объёмы всех шести таблиц равны проектным (12 / 6 / 16 / 11 / 19 / 7);</w:t>
+      </w:r>
+    </w:p>
+    <w:p>
+      <w:pPr>
+        <w:pStyle w:val="ListBullet"/>
+        <w:ind w:firstLine="0"/>
+      </w:pPr>
+      <w:r>
+        <w:t>6.2 — заявки-сироты без тендера отсутствуют (LEFT JOIN + IS NULL даёт 0);</w:t>
+      </w:r>
+    </w:p>
+    <w:p>
+      <w:pPr>
+        <w:pStyle w:val="ListBullet"/>
+        <w:ind w:firstLine="0"/>
+      </w:pPr>
+      <w:r>
+        <w:t>6.3 — протоколы с заявкой чужого тендера отсутствуют (составной FK работает);</w:t>
+      </w:r>
+    </w:p>
+    <w:p>
+      <w:pPr>
+        <w:pStyle w:val="ListBullet"/>
+        <w:ind w:firstLine="0"/>
+      </w:pPr>
+      <w:r>
+        <w:t>6.4 — дубликаты ИНН, e-mail и номеров протоколов отсутствуют;</w:t>
+      </w:r>
+    </w:p>
+    <w:p>
+      <w:pPr>
+        <w:pStyle w:val="ListBullet"/>
+        <w:ind w:firstLine="0"/>
+      </w:pPr>
+      <w:r>
+        <w:t>6.5 — контракты дороже стартовой цены отсутствуют (экономия везде положительна);</w:t>
+      </w:r>
+    </w:p>
+    <w:p>
+      <w:pPr>
+        <w:pStyle w:val="ListBullet"/>
+        <w:ind w:firstLine="0"/>
+      </w:pPr>
+      <w:r>
+        <w:t>6.6 — сводный итог: все четыре группы условий одновременно истинны.</w:t>
+      </w:r>
+    </w:p>
+    <w:p>
+      <w:pPr>
+        <w:spacing w:before="120" w:after="40"/>
+        <w:ind w:firstLine="0"/>
+        <w:jc w:val="center"/>
+      </w:pPr>
+      <w:r>
+        <w:rPr>
+          <w:b/>
+          <w:sz w:val="24"/>
+        </w:rPr>
+        <w:t>Таблица 20 — Самопроверки на живом MySQL 8.4.9: всё зелёное</w:t>
+      </w:r>
+    </w:p>
+    <w:tbl>
+      <w:tblPr>
+        <w:tblStyle w:val="TableGrid"/>
+        <w:tblW w:type="auto" w:w="0"/>
+        <w:jc w:val="center"/>
+        <w:tblLayout w:type="autofit"/>
+        <w:tblLook w:firstColumn="1" w:firstRow="1" w:lastColumn="0" w:lastRow="0" w:noHBand="0" w:noVBand="1" w:val="04A0"/>
+      </w:tblPr>
+      <w:tblGrid>
+        <w:gridCol w:w="2410"/>
+        <w:gridCol w:w="2410"/>
+        <w:gridCol w:w="2410"/>
+        <w:gridCol w:w="2410"/>
+      </w:tblGrid>
+      <w:tr>
+        <w:tc>
+          <w:tcPr>
+            <w:tcW w:type="dxa" w:w="2410"/>
+            <w:shd w:val="clear" w:fill="D9E2F3"/>
+          </w:tcPr>
+          <w:p>
+            <w:pPr>
+              <w:ind w:firstLine="0"/>
+            </w:pPr>
+            <w:r/>
+            <w:r>
+              <w:rPr>
+                <w:b/>
+                <w:sz w:val="22"/>
+              </w:rPr>
+              <w:t>check_name</w:t>
+            </w:r>
+          </w:p>
+        </w:tc>
+        <w:tc>
+          <w:tcPr>
+            <w:tcW w:type="dxa" w:w="2410"/>
+            <w:shd w:val="clear" w:fill="D9E2F3"/>
+          </w:tcPr>
+          <w:p>
+            <w:pPr>
+              <w:ind w:firstLine="0"/>
+            </w:pPr>
+            <w:r/>
+            <w:r>
+              <w:rPr>
+                <w:b/>
+                <w:sz w:val="22"/>
+              </w:rPr>
+              <w:t>value</w:t>
+            </w:r>
+          </w:p>
+        </w:tc>
+        <w:tc>
+          <w:tcPr>
+            <w:tcW w:type="dxa" w:w="2410"/>
+            <w:shd w:val="clear" w:fill="D9E2F3"/>
+          </w:tcPr>
+          <w:p>
+            <w:pPr>
+              <w:ind w:firstLine="0"/>
+            </w:pPr>
+            <w:r/>
+            <w:r>
+              <w:rPr>
+                <w:b/>
+                <w:sz w:val="22"/>
+              </w:rPr>
+              <w:t>expected</w:t>
+            </w:r>
+          </w:p>
+        </w:tc>
+        <w:tc>
+          <w:tcPr>
+            <w:tcW w:type="dxa" w:w="2410"/>
+            <w:shd w:val="clear" w:fill="D9E2F3"/>
+          </w:tcPr>
+          <w:p>
+            <w:pPr>
+              <w:ind w:firstLine="0"/>
+            </w:pPr>
+            <w:r/>
+            <w:r>
+              <w:rPr>
+                <w:b/>
+                <w:sz w:val="22"/>
+              </w:rPr>
+              <w:t>ok</w:t>
+            </w:r>
+          </w:p>
+        </w:tc>
+      </w:tr>
+      <w:tr>
+        <w:tc>
+          <w:tcPr>
+            <w:tcW w:type="dxa" w:w="2410"/>
+          </w:tcPr>
+          <w:p>
+            <w:pPr>
+              <w:ind w:firstLine="0"/>
+            </w:pPr>
+            <w:r/>
+            <w:r>
+              <w:rPr>
+                <w:sz w:val="22"/>
+              </w:rPr>
+              <w:t>companies</w:t>
+            </w:r>
+          </w:p>
+        </w:tc>
+        <w:tc>
+          <w:tcPr>
+            <w:tcW w:type="dxa" w:w="2410"/>
+          </w:tcPr>
+          <w:p>
+            <w:pPr>
+              <w:ind w:firstLine="0"/>
+            </w:pPr>
+            <w:r/>
+            <w:r>
+              <w:rPr>
+                <w:sz w:val="22"/>
+              </w:rPr>
+              <w:t>12</w:t>
+            </w:r>
+          </w:p>
+        </w:tc>
+        <w:tc>
+          <w:tcPr>
+            <w:tcW w:type="dxa" w:w="2410"/>
+          </w:tcPr>
+          <w:p>
+            <w:pPr>
+              <w:ind w:firstLine="0"/>
+            </w:pPr>
+            <w:r/>
+            <w:r>
+              <w:rPr>
+                <w:sz w:val="22"/>
+              </w:rPr>
+              <w:t>12</w:t>
+            </w:r>
+          </w:p>
+        </w:tc>
+        <w:tc>
+          <w:tcPr>
+            <w:tcW w:type="dxa" w:w="2410"/>
+          </w:tcPr>
+          <w:p>
+            <w:pPr>
+              <w:ind w:firstLine="0"/>
+            </w:pPr>
+            <w:r/>
+            <w:r>
+              <w:rPr>
+                <w:sz w:val="22"/>
+              </w:rPr>
+              <w:t>1</w:t>
+            </w:r>
+          </w:p>
+        </w:tc>
+      </w:tr>
+      <w:tr>
+        <w:tc>
+          <w:tcPr>
+            <w:tcW w:type="dxa" w:w="2410"/>
+          </w:tcPr>
+          <w:p>
+            <w:pPr>
+              <w:ind w:firstLine="0"/>
+            </w:pPr>
+            <w:r/>
+            <w:r>
+              <w:rPr>
+                <w:sz w:val="22"/>
+              </w:rPr>
+              <w:t>tender_category</w:t>
+            </w:r>
+          </w:p>
+        </w:tc>
+        <w:tc>
+          <w:tcPr>
+            <w:tcW w:type="dxa" w:w="2410"/>
+          </w:tcPr>
+          <w:p>
+            <w:pPr>
+              <w:ind w:firstLine="0"/>
+            </w:pPr>
+            <w:r/>
+            <w:r>
+              <w:rPr>
+                <w:sz w:val="22"/>
+              </w:rPr>
+              <w:t>6</w:t>
+            </w:r>
+          </w:p>
+        </w:tc>
+        <w:tc>
+          <w:tcPr>
+            <w:tcW w:type="dxa" w:w="2410"/>
+          </w:tcPr>
+          <w:p>
+            <w:pPr>
+              <w:ind w:firstLine="0"/>
+            </w:pPr>
+            <w:r/>
+            <w:r>
+              <w:rPr>
+                <w:sz w:val="22"/>
+              </w:rPr>
+              <w:t>6</w:t>
+            </w:r>
+          </w:p>
+        </w:tc>
+        <w:tc>
+          <w:tcPr>
+            <w:tcW w:type="dxa" w:w="2410"/>
+          </w:tcPr>
+          <w:p>
+            <w:pPr>
+              <w:ind w:firstLine="0"/>
+            </w:pPr>
+            <w:r/>
+            <w:r>
+              <w:rPr>
+                <w:sz w:val="22"/>
+              </w:rPr>
+              <w:t>1</w:t>
+            </w:r>
+          </w:p>
+        </w:tc>
+      </w:tr>
+      <w:tr>
+        <w:tc>
+          <w:tcPr>
+            <w:tcW w:type="dxa" w:w="2410"/>
+          </w:tcPr>
+          <w:p>
+            <w:pPr>
+              <w:ind w:firstLine="0"/>
+            </w:pPr>
+            <w:r/>
+            <w:r>
+              <w:rPr>
+                <w:sz w:val="22"/>
+              </w:rPr>
+              <w:t>accreditation</w:t>
+            </w:r>
+          </w:p>
+        </w:tc>
+        <w:tc>
+          <w:tcPr>
+            <w:tcW w:type="dxa" w:w="2410"/>
+          </w:tcPr>
+          <w:p>
+            <w:pPr>
+              <w:ind w:firstLine="0"/>
+            </w:pPr>
+            <w:r/>
+            <w:r>
+              <w:rPr>
+                <w:sz w:val="22"/>
+              </w:rPr>
+              <w:t>16</w:t>
+            </w:r>
+          </w:p>
+        </w:tc>
+        <w:tc>
+          <w:tcPr>
+            <w:tcW w:type="dxa" w:w="2410"/>
+          </w:tcPr>
+          <w:p>
+            <w:pPr>
+              <w:ind w:firstLine="0"/>
+            </w:pPr>
+            <w:r/>
+            <w:r>
+              <w:rPr>
+                <w:sz w:val="22"/>
+              </w:rPr>
+              <w:t>16</w:t>
+            </w:r>
+          </w:p>
+        </w:tc>
+        <w:tc>
+          <w:tcPr>
+            <w:tcW w:type="dxa" w:w="2410"/>
+          </w:tcPr>
+          <w:p>
+            <w:pPr>
+              <w:ind w:firstLine="0"/>
+            </w:pPr>
+            <w:r/>
+            <w:r>
+              <w:rPr>
+                <w:sz w:val="22"/>
+              </w:rPr>
+              <w:t>1</w:t>
+            </w:r>
+          </w:p>
+        </w:tc>
+      </w:tr>
+      <w:tr>
+        <w:tc>
+          <w:tcPr>
+            <w:tcW w:type="dxa" w:w="2410"/>
+          </w:tcPr>
+          <w:p>
+            <w:pPr>
+              <w:ind w:firstLine="0"/>
+            </w:pPr>
+            <w:r/>
+            <w:r>
+              <w:rPr>
+                <w:sz w:val="22"/>
+              </w:rPr>
+              <w:t>tender</w:t>
+            </w:r>
+          </w:p>
+        </w:tc>
+        <w:tc>
+          <w:tcPr>
+            <w:tcW w:type="dxa" w:w="2410"/>
+          </w:tcPr>
+          <w:p>
+            <w:pPr>
+              <w:ind w:firstLine="0"/>
+            </w:pPr>
+            <w:r/>
+            <w:r>
+              <w:rPr>
+                <w:sz w:val="22"/>
+              </w:rPr>
+              <w:t>11</w:t>
+            </w:r>
+          </w:p>
+        </w:tc>
+        <w:tc>
+          <w:tcPr>
+            <w:tcW w:type="dxa" w:w="2410"/>
+          </w:tcPr>
+          <w:p>
+            <w:pPr>
+              <w:ind w:firstLine="0"/>
+            </w:pPr>
+            <w:r/>
+            <w:r>
+              <w:rPr>
+                <w:sz w:val="22"/>
+              </w:rPr>
+              <w:t>11</w:t>
+            </w:r>
+          </w:p>
+        </w:tc>
+        <w:tc>
+          <w:tcPr>
+            <w:tcW w:type="dxa" w:w="2410"/>
+          </w:tcPr>
+          <w:p>
+            <w:pPr>
+              <w:ind w:firstLine="0"/>
+            </w:pPr>
+            <w:r/>
+            <w:r>
+              <w:rPr>
+                <w:sz w:val="22"/>
+              </w:rPr>
+              <w:t>1</w:t>
+            </w:r>
+          </w:p>
+        </w:tc>
+      </w:tr>
+      <w:tr>
+        <w:tc>
+          <w:tcPr>
+            <w:tcW w:type="dxa" w:w="2410"/>
+          </w:tcPr>
+          <w:p>
+            <w:pPr>
+              <w:ind w:firstLine="0"/>
+            </w:pPr>
+            <w:r/>
+            <w:r>
+              <w:rPr>
+                <w:sz w:val="22"/>
+              </w:rPr>
+              <w:t>application</w:t>
+            </w:r>
+          </w:p>
+        </w:tc>
+        <w:tc>
+          <w:tcPr>
+            <w:tcW w:type="dxa" w:w="2410"/>
+          </w:tcPr>
+          <w:p>
+            <w:pPr>
+              <w:ind w:firstLine="0"/>
+            </w:pPr>
+            <w:r/>
+            <w:r>
+              <w:rPr>
+                <w:sz w:val="22"/>
+              </w:rPr>
+              <w:t>19</w:t>
+            </w:r>
+          </w:p>
+        </w:tc>
+        <w:tc>
+          <w:tcPr>
+            <w:tcW w:type="dxa" w:w="2410"/>
+          </w:tcPr>
+          <w:p>
+            <w:pPr>
+              <w:ind w:firstLine="0"/>
+            </w:pPr>
+            <w:r/>
+            <w:r>
+              <w:rPr>
+                <w:sz w:val="22"/>
+              </w:rPr>
+              <w:t>19</w:t>
+            </w:r>
+          </w:p>
+        </w:tc>
+        <w:tc>
+          <w:tcPr>
+            <w:tcW w:type="dxa" w:w="2410"/>
+          </w:tcPr>
+          <w:p>
+            <w:pPr>
+              <w:ind w:firstLine="0"/>
+            </w:pPr>
+            <w:r/>
+            <w:r>
+              <w:rPr>
+                <w:sz w:val="22"/>
+              </w:rPr>
+              <w:t>1</w:t>
+            </w:r>
+          </w:p>
+        </w:tc>
+      </w:tr>
+      <w:tr>
+        <w:tc>
+          <w:tcPr>
+            <w:tcW w:type="dxa" w:w="2410"/>
+          </w:tcPr>
+          <w:p>
+            <w:pPr>
+              <w:ind w:firstLine="0"/>
+            </w:pPr>
+            <w:r/>
+            <w:r>
+              <w:rPr>
+                <w:sz w:val="22"/>
+              </w:rPr>
+              <w:t>victory_protocol</w:t>
+            </w:r>
+          </w:p>
+        </w:tc>
+        <w:tc>
+          <w:tcPr>
+            <w:tcW w:type="dxa" w:w="2410"/>
+          </w:tcPr>
+          <w:p>
+            <w:pPr>
+              <w:ind w:firstLine="0"/>
+            </w:pPr>
+            <w:r/>
+            <w:r>
+              <w:rPr>
+                <w:sz w:val="22"/>
+              </w:rPr>
+              <w:t>7</w:t>
+            </w:r>
+          </w:p>
+        </w:tc>
+        <w:tc>
+          <w:tcPr>
+            <w:tcW w:type="dxa" w:w="2410"/>
+          </w:tcPr>
+          <w:p>
+            <w:pPr>
+              <w:ind w:firstLine="0"/>
+            </w:pPr>
+            <w:r/>
+            <w:r>
+              <w:rPr>
+                <w:sz w:val="22"/>
+              </w:rPr>
+              <w:t>7</w:t>
+            </w:r>
+          </w:p>
+        </w:tc>
+        <w:tc>
+          <w:tcPr>
+            <w:tcW w:type="dxa" w:w="2410"/>
+          </w:tcPr>
+          <w:p>
+            <w:pPr>
+              <w:ind w:firstLine="0"/>
+            </w:pPr>
+            <w:r/>
+            <w:r>
+              <w:rPr>
+                <w:sz w:val="22"/>
+              </w:rPr>
+              <w:t>1</w:t>
+            </w:r>
+          </w:p>
+        </w:tc>
+      </w:tr>
+      <w:tr>
+        <w:tc>
+          <w:tcPr>
+            <w:tcW w:type="dxa" w:w="2410"/>
+          </w:tcPr>
+          <w:p>
+            <w:pPr>
+              <w:ind w:firstLine="0"/>
+            </w:pPr>
+            <w:r/>
+            <w:r>
+              <w:rPr>
+                <w:sz w:val="22"/>
+              </w:rPr>
+              <w:t>orphan_applications</w:t>
+            </w:r>
+          </w:p>
+        </w:tc>
+        <w:tc>
+          <w:tcPr>
+            <w:tcW w:type="dxa" w:w="2410"/>
+          </w:tcPr>
+          <w:p>
+            <w:pPr>
+              <w:ind w:firstLine="0"/>
+            </w:pPr>
+            <w:r/>
+            <w:r>
+              <w:rPr>
+                <w:sz w:val="22"/>
+              </w:rPr>
+              <w:t>0</w:t>
+            </w:r>
+          </w:p>
+        </w:tc>
+        <w:tc>
+          <w:tcPr>
+            <w:tcW w:type="dxa" w:w="2410"/>
+          </w:tcPr>
+          <w:p>
+            <w:pPr>
+              <w:ind w:firstLine="0"/>
+            </w:pPr>
+            <w:r/>
+            <w:r>
+              <w:rPr>
+                <w:sz w:val="22"/>
+              </w:rPr>
+              <w:t>0</w:t>
+            </w:r>
+          </w:p>
+        </w:tc>
+        <w:tc>
+          <w:tcPr>
+            <w:tcW w:type="dxa" w:w="2410"/>
+          </w:tcPr>
+          <w:p>
+            <w:pPr>
+              <w:ind w:firstLine="0"/>
+            </w:pPr>
+            <w:r/>
+            <w:r>
+              <w:rPr>
+                <w:sz w:val="22"/>
+              </w:rPr>
+              <w:t>1</w:t>
+            </w:r>
+          </w:p>
+        </w:tc>
+      </w:tr>
+      <w:tr>
+        <w:tc>
+          <w:tcPr>
+            <w:tcW w:type="dxa" w:w="2410"/>
+          </w:tcPr>
+          <w:p>
+            <w:pPr>
+              <w:ind w:firstLine="0"/>
+            </w:pPr>
+            <w:r/>
+            <w:r>
+              <w:rPr>
+                <w:sz w:val="22"/>
+              </w:rPr>
+              <w:t>winner_wrong_tender</w:t>
+            </w:r>
+          </w:p>
+        </w:tc>
+        <w:tc>
+          <w:tcPr>
+            <w:tcW w:type="dxa" w:w="2410"/>
+          </w:tcPr>
+          <w:p>
+            <w:pPr>
+              <w:ind w:firstLine="0"/>
+            </w:pPr>
+            <w:r/>
+            <w:r>
+              <w:rPr>
+                <w:sz w:val="22"/>
+              </w:rPr>
+              <w:t>0</w:t>
+            </w:r>
+          </w:p>
+        </w:tc>
+        <w:tc>
+          <w:tcPr>
+            <w:tcW w:type="dxa" w:w="2410"/>
+          </w:tcPr>
+          <w:p>
+            <w:pPr>
+              <w:ind w:firstLine="0"/>
+            </w:pPr>
+            <w:r/>
+            <w:r>
+              <w:rPr>
+                <w:sz w:val="22"/>
+              </w:rPr>
+              <w:t>0</w:t>
+            </w:r>
+          </w:p>
+        </w:tc>
+        <w:tc>
+          <w:tcPr>
+            <w:tcW w:type="dxa" w:w="2410"/>
+          </w:tcPr>
+          <w:p>
+            <w:pPr>
+              <w:ind w:firstLine="0"/>
+            </w:pPr>
+            <w:r/>
+            <w:r>
+              <w:rPr>
+                <w:sz w:val="22"/>
+              </w:rPr>
+              <w:t>1</w:t>
+            </w:r>
+          </w:p>
+        </w:tc>
+      </w:tr>
+      <w:tr>
+        <w:tc>
+          <w:tcPr>
+            <w:tcW w:type="dxa" w:w="2410"/>
+          </w:tcPr>
+          <w:p>
+            <w:pPr>
+              <w:ind w:firstLine="0"/>
+            </w:pPr>
+            <w:r/>
+            <w:r>
+              <w:rPr>
+                <w:sz w:val="22"/>
+              </w:rPr>
+              <w:t>dup_stir / dup_email / dup_protocol_no</w:t>
+            </w:r>
+          </w:p>
+        </w:tc>
+        <w:tc>
+          <w:tcPr>
+            <w:tcW w:type="dxa" w:w="2410"/>
+          </w:tcPr>
+          <w:p>
+            <w:pPr>
+              <w:ind w:firstLine="0"/>
+            </w:pPr>
+            <w:r/>
+            <w:r>
+              <w:rPr>
+                <w:sz w:val="22"/>
+              </w:rPr>
+              <w:t>0 / 0 / 0</w:t>
+            </w:r>
+          </w:p>
+        </w:tc>
+        <w:tc>
+          <w:tcPr>
+            <w:tcW w:type="dxa" w:w="2410"/>
+          </w:tcPr>
+          <w:p>
+            <w:pPr>
+              <w:ind w:firstLine="0"/>
+            </w:pPr>
+            <w:r/>
+            <w:r>
+              <w:rPr>
+                <w:sz w:val="22"/>
+              </w:rPr>
+              <w:t>0</w:t>
+            </w:r>
+          </w:p>
+        </w:tc>
+        <w:tc>
+          <w:tcPr>
+            <w:tcW w:type="dxa" w:w="2410"/>
+          </w:tcPr>
+          <w:p>
+            <w:pPr>
+              <w:ind w:firstLine="0"/>
+            </w:pPr>
+            <w:r/>
+            <w:r>
+              <w:rPr>
+                <w:sz w:val="22"/>
+              </w:rPr>
+              <w:t>1</w:t>
+            </w:r>
+          </w:p>
+        </w:tc>
+      </w:tr>
+      <w:tr>
+        <w:tc>
+          <w:tcPr>
+            <w:tcW w:type="dxa" w:w="2410"/>
+          </w:tcPr>
+          <w:p>
+            <w:pPr>
+              <w:ind w:firstLine="0"/>
+            </w:pPr>
+            <w:r/>
+            <w:r>
+              <w:rPr>
+                <w:sz w:val="22"/>
+              </w:rPr>
+              <w:t>negative_saving</w:t>
+            </w:r>
+          </w:p>
+        </w:tc>
+        <w:tc>
+          <w:tcPr>
+            <w:tcW w:type="dxa" w:w="2410"/>
+          </w:tcPr>
+          <w:p>
+            <w:pPr>
+              <w:ind w:firstLine="0"/>
+            </w:pPr>
+            <w:r/>
+            <w:r>
+              <w:rPr>
+                <w:sz w:val="22"/>
+              </w:rPr>
+              <w:t>0</w:t>
+            </w:r>
+          </w:p>
+        </w:tc>
+        <w:tc>
+          <w:tcPr>
+            <w:tcW w:type="dxa" w:w="2410"/>
+          </w:tcPr>
+          <w:p>
+            <w:pPr>
+              <w:ind w:firstLine="0"/>
+            </w:pPr>
+            <w:r/>
+            <w:r>
+              <w:rPr>
+                <w:sz w:val="22"/>
+              </w:rPr>
+              <w:t>0</w:t>
+            </w:r>
+          </w:p>
+        </w:tc>
+        <w:tc>
+          <w:tcPr>
+            <w:tcW w:type="dxa" w:w="2410"/>
+          </w:tcPr>
+          <w:p>
+            <w:pPr>
+              <w:ind w:firstLine="0"/>
+            </w:pPr>
+            <w:r/>
+            <w:r>
+              <w:rPr>
+                <w:sz w:val="22"/>
+              </w:rPr>
+              <w:t>1</w:t>
+            </w:r>
+          </w:p>
+        </w:tc>
+      </w:tr>
+    </w:tbl>
+    <w:p>
+      <w:pPr>
+        <w:spacing w:after="40"/>
+      </w:pPr>
+    </w:p>
+    <w:p>
+      <w:pPr>
+        <w:ind w:firstLine="709"/>
+        <w:jc w:val="both"/>
+      </w:pPr>
+      <w:r>
+        <w:rPr>
+          <w:b w:val="0"/>
+          <w:i w:val="0"/>
+        </w:rPr>
+        <w:t>Таким образом, корректность подтверждена дважды: визуально (рисунки 2–5) и программно (самопроверки внутри скрипта). Любая будущая правка данных, ломающая инварианты, будет сразу видна как ok = 0.</w:t>
       </w:r>
     </w:p>
     <w:p>

</xml_diff>

<commit_message>
Student console screenshots embedded (9 figures), README console section
</commit_message>
<xml_diff>
--- a/Самостоятельная работа по БД.docx
+++ b/Самостоятельная работа по БД.docx
@@ -6717,6 +6717,55 @@
     </w:p>
     <w:p>
       <w:pPr>
+        <w:spacing w:before="120"/>
+        <w:ind w:firstLine="0"/>
+        <w:jc w:val="center"/>
+      </w:pPr>
+      <w:r>
+        <w:drawing>
+          <wp:inline xmlns:a="http://schemas.openxmlformats.org/drawingml/2006/main" xmlns:pic="http://schemas.openxmlformats.org/drawingml/2006/picture">
+            <wp:extent cx="5940000" cy="2973123"/>
+            <wp:docPr id="6" name="Picture 6"/>
+            <wp:cNvGraphicFramePr>
+              <a:graphicFrameLocks noChangeAspect="1"/>
+            </wp:cNvGraphicFramePr>
+            <a:graphic>
+              <a:graphicData uri="http://schemas.openxmlformats.org/drawingml/2006/picture">
+                <pic:pic>
+                  <pic:nvPicPr>
+                    <pic:cNvPr id="0" name="Консоль 1 — таблица company.png"/>
+                    <pic:cNvPicPr/>
+                  </pic:nvPicPr>
+                  <pic:blipFill>
+                    <a:blip r:embed="rId15"/>
+                    <a:stretch>
+                      <a:fillRect/>
+                    </a:stretch>
+                  </pic:blipFill>
+                  <pic:spPr>
+                    <a:xfrm>
+                      <a:off x="0" y="0"/>
+                      <a:ext cx="5940000" cy="2973123"/>
+                    </a:xfrm>
+                    <a:prstGeom prst="rect"/>
+                  </pic:spPr>
+                </pic:pic>
+              </a:graphicData>
+            </a:graphic>
+          </wp:inline>
+        </w:drawing>
+        <w:br/>
+      </w:r>
+      <w:r>
+        <w:rPr>
+          <w:b/>
+          <w:sz w:val="24"/>
+        </w:rPr>
+        <w:t>Рисунок 2 — выполнение студента: содержимое таблицы company (12 строк)</w:t>
+      </w:r>
+    </w:p>
+    <w:p>
+      <w:pPr>
         <w:ind w:firstLine="709"/>
         <w:jc w:val="both"/>
       </w:pPr>
@@ -10071,6 +10120,55 @@
     </w:p>
     <w:p>
       <w:pPr>
+        <w:spacing w:before="120"/>
+        <w:ind w:firstLine="0"/>
+        <w:jc w:val="center"/>
+      </w:pPr>
+      <w:r>
+        <w:drawing>
+          <wp:inline xmlns:a="http://schemas.openxmlformats.org/drawingml/2006/main" xmlns:pic="http://schemas.openxmlformats.org/drawingml/2006/picture">
+            <wp:extent cx="5940000" cy="1963431"/>
+            <wp:docPr id="7" name="Picture 7"/>
+            <wp:cNvGraphicFramePr>
+              <a:graphicFrameLocks noChangeAspect="1"/>
+            </wp:cNvGraphicFramePr>
+            <a:graphic>
+              <a:graphicData uri="http://schemas.openxmlformats.org/drawingml/2006/picture">
+                <pic:pic>
+                  <pic:nvPicPr>
+                    <pic:cNvPr id="0" name="Консоль 3 — тендеры.png"/>
+                    <pic:cNvPicPr/>
+                  </pic:nvPicPr>
+                  <pic:blipFill>
+                    <a:blip r:embed="rId16"/>
+                    <a:stretch>
+                      <a:fillRect/>
+                    </a:stretch>
+                  </pic:blipFill>
+                  <pic:spPr>
+                    <a:xfrm>
+                      <a:off x="0" y="0"/>
+                      <a:ext cx="5940000" cy="1963431"/>
+                    </a:xfrm>
+                    <a:prstGeom prst="rect"/>
+                  </pic:spPr>
+                </pic:pic>
+              </a:graphicData>
+            </a:graphic>
+          </wp:inline>
+        </w:drawing>
+        <w:br/>
+      </w:r>
+      <w:r>
+        <w:rPr>
+          <w:b/>
+          <w:sz w:val="24"/>
+        </w:rPr>
+        <w:t>Рисунок 3 — выполнение студента: тендеры и текст запроса о победителях</w:t>
+      </w:r>
+    </w:p>
+    <w:p>
+      <w:pPr>
         <w:pStyle w:val="Heading3"/>
       </w:pPr>
       <w:r>
@@ -10613,7 +10711,7 @@
       </w:pPr>
       <w:r/>
       <w:r>
-        <w:t>Работоспособность проекта подтверждена фактическим выполнением скрипта: все операторы DDL и DML отработали без ошибок, ограничения целостности не нарушены (внешние ключи, уникальность ИНН, e-mail и номеров протоколов соблюдены), а контрольные запросы вернули ожидаемые наборы строк. Ниже приведены рисунки 2–5 с фактическими результатами: состав базы после загрузки данных, открытые тендеры, победители с экономией бюджета, а также итоги операций INTERSECT и EXCEPT.</w:t>
+        <w:t>Работоспособность проекта подтверждена фактическим выполнением скрипта: все операторы DDL и DML отработали без ошибок, ограничения целостности не нарушены (внешние ключи, уникальность ИНН, e-mail и номеров протоколов соблюдены), а контрольные запросы вернули ожидаемые наборы строк. Ниже приведены рисунки 2–9 с фактическими результатами: состав базы после загрузки данных, открытые тендеры, победители с экономией бюджета, а также итоги операций INTERSECT и EXCEPT.</w:t>
       </w:r>
     </w:p>
     <w:p>
@@ -10663,7 +10761,7 @@
           <w:b/>
           <w:sz w:val="24"/>
         </w:rPr>
-        <w:t>Рисунок 2 — Состав базы tender_platform_oktamov после выполнения скрипта</w:t>
+        <w:t>Рисунок 4 — Состав базы tender_platform_oktamov после выполнения скрипта</w:t>
       </w:r>
     </w:p>
     <w:p>
@@ -10714,7 +10812,7 @@
           <w:b/>
           <w:sz w:val="24"/>
         </w:rPr>
-        <w:t>Рисунок 3 — Результат запроса 6: открытые тендеры</w:t>
+        <w:t>Рисунок 5 — Результат запроса 6: открытые тендеры</w:t>
       </w:r>
       <w:r>
         <w:drawing>
@@ -10756,7 +10854,7 @@
           <w:b/>
           <w:sz w:val="24"/>
         </w:rPr>
-        <w:t>Рисунок 4 — Результат запроса 8: победители и экономия бюджета</w:t>
+        <w:t>Рисунок 6 — Результат запроса 8: победители и экономия бюджета</w:t>
       </w:r>
     </w:p>
     <w:p>
@@ -10806,7 +10904,56 @@
           <w:b/>
           <w:sz w:val="24"/>
         </w:rPr>
-        <w:t>Рисунок 5 — Результаты запросов 10 (INTERSECT) и 11 (EXCEPT)</w:t>
+        <w:t>Рисунок 7 — Результаты запросов 10 (INTERSECT) и 11 (EXCEPT)</w:t>
+      </w:r>
+    </w:p>
+    <w:p>
+      <w:pPr>
+        <w:spacing w:before="120"/>
+        <w:ind w:firstLine="0"/>
+        <w:jc w:val="center"/>
+      </w:pPr>
+      <w:r>
+        <w:drawing>
+          <wp:inline xmlns:a="http://schemas.openxmlformats.org/drawingml/2006/main" xmlns:pic="http://schemas.openxmlformats.org/drawingml/2006/picture">
+            <wp:extent cx="5940000" cy="2949732"/>
+            <wp:docPr id="8" name="Picture 8"/>
+            <wp:cNvGraphicFramePr>
+              <a:graphicFrameLocks noChangeAspect="1"/>
+            </wp:cNvGraphicFramePr>
+            <a:graphic>
+              <a:graphicData uri="http://schemas.openxmlformats.org/drawingml/2006/picture">
+                <pic:pic>
+                  <pic:nvPicPr>
+                    <pic:cNvPr id="0" name="Консоль 2 — протоколы и таблицы.png"/>
+                    <pic:cNvPicPr/>
+                  </pic:nvPicPr>
+                  <pic:blipFill>
+                    <a:blip r:embed="rId17"/>
+                    <a:stretch>
+                      <a:fillRect/>
+                    </a:stretch>
+                  </pic:blipFill>
+                  <pic:spPr>
+                    <a:xfrm>
+                      <a:off x="0" y="0"/>
+                      <a:ext cx="5940000" cy="2949732"/>
+                    </a:xfrm>
+                    <a:prstGeom prst="rect"/>
+                  </pic:spPr>
+                </pic:pic>
+              </a:graphicData>
+            </a:graphic>
+          </wp:inline>
+        </w:drawing>
+        <w:br/>
+      </w:r>
+      <w:r>
+        <w:rPr>
+          <w:b/>
+          <w:sz w:val="24"/>
+        </w:rPr>
+        <w:t>Рисунок 8 — выполнение студента: протоколы победы и состав базы</w:t>
       </w:r>
     </w:p>
     <w:p>
@@ -11719,7 +11866,56 @@
           <w:b w:val="0"/>
           <w:i w:val="0"/>
         </w:rPr>
-        <w:t>Таким образом, корректность подтверждена дважды: визуально (рисунки 2–5) и программно (самопроверки внутри скрипта). Любая будущая правка данных, ломающая инварианты, будет сразу видна как ok = 0.</w:t>
+        <w:t>Таким образом, корректность подтверждена дважды: визуально (рисунки 2–9) и программно (самопроверки внутри скрипта). Любая будущая правка данных, ломающая инварианты, будет сразу видна как ok = 0.</w:t>
+      </w:r>
+    </w:p>
+    <w:p>
+      <w:pPr>
+        <w:spacing w:before="120"/>
+        <w:ind w:firstLine="0"/>
+        <w:jc w:val="center"/>
+      </w:pPr>
+      <w:r>
+        <w:drawing>
+          <wp:inline xmlns:a="http://schemas.openxmlformats.org/drawingml/2006/main" xmlns:pic="http://schemas.openxmlformats.org/drawingml/2006/picture">
+            <wp:extent cx="5940000" cy="1603800"/>
+            <wp:docPr id="9" name="Picture 9"/>
+            <wp:cNvGraphicFramePr>
+              <a:graphicFrameLocks noChangeAspect="1"/>
+            </wp:cNvGraphicFramePr>
+            <a:graphic>
+              <a:graphicData uri="http://schemas.openxmlformats.org/drawingml/2006/picture">
+                <pic:pic>
+                  <pic:nvPicPr>
+                    <pic:cNvPr id="0" name="Консоль 4 — победители и самопроверки.png"/>
+                    <pic:cNvPicPr/>
+                  </pic:nvPicPr>
+                  <pic:blipFill>
+                    <a:blip r:embed="rId18"/>
+                    <a:stretch>
+                      <a:fillRect/>
+                    </a:stretch>
+                  </pic:blipFill>
+                  <pic:spPr>
+                    <a:xfrm>
+                      <a:off x="0" y="0"/>
+                      <a:ext cx="5940000" cy="1603800"/>
+                    </a:xfrm>
+                    <a:prstGeom prst="rect"/>
+                  </pic:spPr>
+                </pic:pic>
+              </a:graphicData>
+            </a:graphic>
+          </wp:inline>
+        </w:drawing>
+        <w:br/>
+      </w:r>
+      <w:r>
+        <w:rPr>
+          <w:b/>
+          <w:sz w:val="24"/>
+        </w:rPr>
+        <w:t>Рисунок 9 — выполнение студента: экономия и самопроверки — всё зелёное</w:t>
       </w:r>
     </w:p>
     <w:p>

</xml_diff>

<commit_message>
Remove generated screenshots, keep only student console photos (5 figures)
</commit_message>
<xml_diff>
--- a/Самостоятельная работа по БД.docx
+++ b/Самостоятельная работа по БД.docx
@@ -10711,200 +10711,7 @@
       </w:pPr>
       <w:r/>
       <w:r>
-        <w:t>Работоспособность проекта подтверждена фактическим выполнением скрипта: все операторы DDL и DML отработали без ошибок, ограничения целостности не нарушены (внешние ключи, уникальность ИНН, e-mail и номеров протоколов соблюдены), а контрольные запросы вернули ожидаемые наборы строк. Ниже приведены рисунки 2–9 с фактическими результатами: состав базы после загрузки данных, открытые тендеры, победители с экономией бюджета, а также итоги операций INTERSECT и EXCEPT.</w:t>
-      </w:r>
-    </w:p>
-    <w:p>
-      <w:pPr>
-        <w:ind w:firstLine="0"/>
-        <w:jc w:val="center"/>
-        <w:shd w:val="clear" w:fill="FFF2CC"/>
-      </w:pPr>
-      <w:r/>
-      <w:r>
-        <w:drawing>
-          <wp:inline xmlns:a="http://schemas.openxmlformats.org/drawingml/2006/main" xmlns:pic="http://schemas.openxmlformats.org/drawingml/2006/picture">
-            <wp:extent cx="5940000" cy="1780465"/>
-            <wp:docPr id="2" name="Picture 2"/>
-            <wp:cNvGraphicFramePr>
-              <a:graphicFrameLocks noChangeAspect="1"/>
-            </wp:cNvGraphicFramePr>
-            <a:graphic>
-              <a:graphicData uri="http://schemas.openxmlformats.org/drawingml/2006/picture">
-                <pic:pic>
-                  <pic:nvPicPr>
-                    <pic:cNvPr id="0" name="Скриншот 1 — состав базы.png"/>
-                    <pic:cNvPicPr/>
-                  </pic:nvPicPr>
-                  <pic:blipFill>
-                    <a:blip r:embed="rId11"/>
-                    <a:stretch>
-                      <a:fillRect/>
-                    </a:stretch>
-                  </pic:blipFill>
-                  <pic:spPr>
-                    <a:xfrm>
-                      <a:off x="0" y="0"/>
-                      <a:ext cx="5940000" cy="1780465"/>
-                    </a:xfrm>
-                    <a:prstGeom prst="rect"/>
-                  </pic:spPr>
-                </pic:pic>
-              </a:graphicData>
-            </a:graphic>
-          </wp:inline>
-        </w:drawing>
-        <w:br/>
-      </w:r>
-      <w:r>
-        <w:rPr>
-          <w:b/>
-          <w:sz w:val="24"/>
-        </w:rPr>
-        <w:t>Рисунок 4 — Состав базы tender_platform_oktamov после выполнения скрипта</w:t>
-      </w:r>
-    </w:p>
-    <w:p>
-      <w:pPr>
-        <w:ind w:firstLine="0"/>
-        <w:jc w:val="center"/>
-        <w:shd w:val="clear" w:fill="FFF2CC"/>
-      </w:pPr>
-      <w:r/>
-      <w:r>
-        <w:drawing>
-          <wp:inline xmlns:a="http://schemas.openxmlformats.org/drawingml/2006/main" xmlns:pic="http://schemas.openxmlformats.org/drawingml/2006/picture">
-            <wp:extent cx="5940000" cy="1005348"/>
-            <wp:docPr id="3" name="Picture 3"/>
-            <wp:cNvGraphicFramePr>
-              <a:graphicFrameLocks noChangeAspect="1"/>
-            </wp:cNvGraphicFramePr>
-            <a:graphic>
-              <a:graphicData uri="http://schemas.openxmlformats.org/drawingml/2006/picture">
-                <pic:pic>
-                  <pic:nvPicPr>
-                    <pic:cNvPr id="0" name="Скриншот 2 — открытые тендеры.png"/>
-                    <pic:cNvPicPr/>
-                  </pic:nvPicPr>
-                  <pic:blipFill>
-                    <a:blip r:embed="rId12"/>
-                    <a:stretch>
-                      <a:fillRect/>
-                    </a:stretch>
-                  </pic:blipFill>
-                  <pic:spPr>
-                    <a:xfrm>
-                      <a:off x="0" y="0"/>
-                      <a:ext cx="5940000" cy="1005348"/>
-                    </a:xfrm>
-                    <a:prstGeom prst="rect"/>
-                  </pic:spPr>
-                </pic:pic>
-              </a:graphicData>
-            </a:graphic>
-          </wp:inline>
-        </w:drawing>
-        <w:br/>
-        <w:br/>
-      </w:r>
-      <w:r>
-        <w:rPr>
-          <w:b/>
-          <w:sz w:val="24"/>
-        </w:rPr>
-        <w:t>Рисунок 5 — Результат запроса 6: открытые тендеры</w:t>
-      </w:r>
-      <w:r>
-        <w:drawing>
-          <wp:inline xmlns:a="http://schemas.openxmlformats.org/drawingml/2006/main" xmlns:pic="http://schemas.openxmlformats.org/drawingml/2006/picture">
-            <wp:extent cx="5940000" cy="1974884"/>
-            <wp:docPr id="4" name="Picture 4"/>
-            <wp:cNvGraphicFramePr>
-              <a:graphicFrameLocks noChangeAspect="1"/>
-            </wp:cNvGraphicFramePr>
-            <a:graphic>
-              <a:graphicData uri="http://schemas.openxmlformats.org/drawingml/2006/picture">
-                <pic:pic>
-                  <pic:nvPicPr>
-                    <pic:cNvPr id="0" name="Скриншот 3 — победители.png"/>
-                    <pic:cNvPicPr/>
-                  </pic:nvPicPr>
-                  <pic:blipFill>
-                    <a:blip r:embed="rId13"/>
-                    <a:stretch>
-                      <a:fillRect/>
-                    </a:stretch>
-                  </pic:blipFill>
-                  <pic:spPr>
-                    <a:xfrm>
-                      <a:off x="0" y="0"/>
-                      <a:ext cx="5940000" cy="1974884"/>
-                    </a:xfrm>
-                    <a:prstGeom prst="rect"/>
-                  </pic:spPr>
-                </pic:pic>
-              </a:graphicData>
-            </a:graphic>
-          </wp:inline>
-        </w:drawing>
-        <w:br/>
-      </w:r>
-      <w:r>
-        <w:rPr>
-          <w:b/>
-          <w:sz w:val="24"/>
-        </w:rPr>
-        <w:t>Рисунок 6 — Результат запроса 8: победители и экономия бюджета</w:t>
-      </w:r>
-    </w:p>
-    <w:p>
-      <w:pPr>
-        <w:ind w:firstLine="0"/>
-        <w:jc w:val="center"/>
-        <w:shd w:val="clear" w:fill="FFF2CC"/>
-      </w:pPr>
-      <w:r/>
-      <w:r>
-        <w:drawing>
-          <wp:inline xmlns:a="http://schemas.openxmlformats.org/drawingml/2006/main" xmlns:pic="http://schemas.openxmlformats.org/drawingml/2006/picture">
-            <wp:extent cx="5940000" cy="1611628"/>
-            <wp:docPr id="5" name="Picture 5"/>
-            <wp:cNvGraphicFramePr>
-              <a:graphicFrameLocks noChangeAspect="1"/>
-            </wp:cNvGraphicFramePr>
-            <a:graphic>
-              <a:graphicData uri="http://schemas.openxmlformats.org/drawingml/2006/picture">
-                <pic:pic>
-                  <pic:nvPicPr>
-                    <pic:cNvPr id="0" name="Скриншот 4 — INTERSECT и EXCEPT.png"/>
-                    <pic:cNvPicPr/>
-                  </pic:nvPicPr>
-                  <pic:blipFill>
-                    <a:blip r:embed="rId14"/>
-                    <a:stretch>
-                      <a:fillRect/>
-                    </a:stretch>
-                  </pic:blipFill>
-                  <pic:spPr>
-                    <a:xfrm>
-                      <a:off x="0" y="0"/>
-                      <a:ext cx="5940000" cy="1611628"/>
-                    </a:xfrm>
-                    <a:prstGeom prst="rect"/>
-                  </pic:spPr>
-                </pic:pic>
-              </a:graphicData>
-            </a:graphic>
-          </wp:inline>
-        </w:drawing>
-        <w:br/>
-      </w:r>
-      <w:r>
-        <w:rPr>
-          <w:b/>
-          <w:sz w:val="24"/>
-        </w:rPr>
-        <w:t>Рисунок 7 — Результаты запросов 10 (INTERSECT) и 11 (EXCEPT)</w:t>
+        <w:t>Работоспособность проекта подтверждена фактическим выполнением скрипта студентом в консоли MySQL 8.4: все операторы DDL и DML отработали без ошибок, ограничения целостности не нарушены, а контрольные запросы вернули ожидаемые наборы строк. Ниже приведены рисунки 2–5 — скриншоты консоли: содержимое таблицы company, список тендеров, протоколы победы и состав базы, победители с экономией и зелёные самопроверки.</w:t>
       </w:r>
     </w:p>
     <w:p>
@@ -10953,7 +10760,7 @@
           <w:b/>
           <w:sz w:val="24"/>
         </w:rPr>
-        <w:t>Рисунок 8 — выполнение студента: протоколы победы и состав базы</w:t>
+        <w:t>Рисунок 4 — выполнение студента: протоколы победы и состав базы</w:t>
       </w:r>
     </w:p>
     <w:p>
@@ -11866,7 +11673,7 @@
           <w:b w:val="0"/>
           <w:i w:val="0"/>
         </w:rPr>
-        <w:t>Таким образом, корректность подтверждена дважды: визуально (рисунки 2–9) и программно (самопроверки внутри скрипта). Любая будущая правка данных, ломающая инварианты, будет сразу видна как ok = 0.</w:t>
+        <w:t>Таким образом, корректность подтверждена дважды: визуально (рисунки 2–5) и программно (самопроверки внутри скрипта). Любая будущая правка данных, ломающая инварианты, будет сразу видна как ok = 0.</w:t>
       </w:r>
     </w:p>
     <w:p>
@@ -11915,7 +11722,7 @@
           <w:b/>
           <w:sz w:val="24"/>
         </w:rPr>
-        <w:t>Рисунок 9 — выполнение студента: экономия и самопроверки — всё зелёное</w:t>
+        <w:t>Рисунок 5 — выполнение студента: экономия и самопроверки — всё зелёное</w:t>
       </w:r>
     </w:p>
     <w:p>

</xml_diff>